<commit_message>
Table captions: full-width block above the table, table at natural size
Lift each table's caption out of the <table> into a full-width
<div class="tcap"> above it, so a narrow table keeps its natural width
while the caption reads across the whole text column (replaces the earlier
min-width floor). Applied as a post-assembly transform in build_paper.py;
_renumber still keys off "<b>Table N.</b>", now inside the div.

build_latex.py: table captions now arrive from pandoc as a standalone
"\textbf{Table N.} ..." paragraph before a caption-less longtable, so the
float builder pairs that paragraph with the following longtable instead of
reading an in-table \caption.

Verified across all five deliverables; DOCX formats keep the caption as a
paragraph above each table.

Co-Authored-By: Claude Opus 4.8 <noreply@anthropic.com>
</commit_message>
<xml_diff>
--- a/docs/paper-2col.docx
+++ b/docs/paper-2col.docx
@@ -2563,7 +2563,6 @@
         <w:tblW w:type="pct" w:w="5000"/>
         <w:jc w:val="center"/>
         <w:tblLook w:firstRow="1" w:lastRow="0" w:firstColumn="0" w:lastColumn="0" w:noHBand="0" w:noVBand="0" w:val="0020"/>
-        <w:tblCaption w:val="Table 1. Bytes saved by atlasing (%) at matched per-tile SSIM 0.97 (lossy codecs; interpolated on the quality ladder) or exact lossless comparison (-ll columns), grid packing, no padding. Negative values (red) mean the atlas is larger; n/a marks a cell whose quality ladder lies entirely above the target with no interpolable point."/>
         <w:tblLayout w:type="autofit"/>
         <w:tblBorders>
           <w:top w:val="single" w:sz="10" w:color="4F6272"/>
@@ -5966,7 +5965,6 @@
         <w:tblW w:type="pct" w:w="5000"/>
         <w:jc w:val="center"/>
         <w:tblLook w:firstRow="1" w:lastRow="0" w:firstColumn="0" w:lastColumn="0" w:noHBand="0" w:noVBand="0" w:val="0020"/>
-        <w:tblCaption w:val="Table 2. Per-tile SSIM distribution (mean, 5th percentile, minimum) for individual files versus the grid atlas at equal encoder quality (q80, N=500). Matching the mean can still leave the atlas with a worse worst tile: the flat-art WebP atlas has a tile stuck near 0.85 that no quality setting recovers, a shared-segment boundary casualty, whereas JPEG's atlas and individual tails coincide."/>
         <w:tblLayout w:type="autofit"/>
         <w:tblBorders>
           <w:top w:val="single" w:sz="10" w:color="4F6272"/>
@@ -7206,7 +7204,6 @@
         <w:tblW w:type="pct" w:w="5000"/>
         <w:jc w:val="center"/>
         <w:tblLook w:firstRow="1" w:lastRow="0" w:firstColumn="0" w:lastColumn="0" w:noHBand="0" w:noVBand="0" w:val="0020"/>
-        <w:tblCaption w:val="Table 3. Robustness of the photo crossover under a modern perceptual metric: bytes saved by atlasing (%) at matched SSIMULACRA2 (reference libjxl implementation), for 100 photographic tiles scored on the full grid image at two quality targets. JPEG stays positive at every size; WebP is positive only at 56 px and turns clearly negative by 112 px. The direction matches the luma-SSIM result of Table 1, and the WebP penalty is larger under SSIMULACRA2, which weights the chroma and blocking artifacts of VP8's shared quantizer more heavily. Negative values (red) mean the atlas is larger."/>
         <w:tblLayout w:type="autofit"/>
         <w:tblBorders>
           <w:top w:val="single" w:sz="10" w:color="4F6272"/>
@@ -8004,7 +8001,6 @@
         <w:jc w:val="center"/>
         <w:tblLayout w:type="autofit"/>
         <w:tblLook w:firstRow="1" w:lastRow="0" w:firstColumn="0" w:lastColumn="0" w:noHBand="0" w:noVBand="0" w:val="0020"/>
-        <w:tblCaption w:val="Table 4. Cross-corpus, cross-codec crossover: bytes saved by atlasing (%) at matched SSIM 0.97, median over four independent natural-photo populations (Lorem Picsum and three loremflickr categories: generic, nature, food; 60 tiles each), with the per-corpus range in brackets. The sign and size of the effect are consistent across populations: JPEG and AVIF stay positive at every tile size while WebP crosses zero near 112 px and is negative by 224 px. AVIF, with the largest container floor, gains the most at small sizes. A model trained on any three corpora predicts the held-out fourth's saving to 4.6 percentage points mean absolute error (leave-one-corpus-out over 36 cells), so the crossover is a codec-and-size regime, not a corpus-specific effect. Negative values (red) mean the atlas is larger."/>
         <w:tblBorders>
           <w:top w:val="single" w:sz="10" w:color="4F6272"/>
           <w:bottom w:val="single" w:sz="10" w:color="4F6272"/>
@@ -9062,7 +9058,6 @@
         <w:tblW w:type="pct" w:w="5000"/>
         <w:jc w:val="center"/>
         <w:tblLook w:firstRow="1" w:lastRow="0" w:firstColumn="0" w:lastColumn="0" w:noHBand="0" w:noVBand="0" w:val="0020"/>
-        <w:tblCaption w:val="Table 5. Bundle bytes for 200 synthetic flat icons (fixed 12-color palette, alpha), lossless unless noted, on a clean corpus and one with 20% exact + 20% near-duplicate tiles. Lossless bundles are byte-exact (palette conversion verified identical after decode); the JPEG row is the matched-SSIM-0.97 grid atlas. The 90–97% shared-palette saving cited in the text is measured against individual paletted PNGs (per tile), whose byte totals are in the released data. Smaller is better."/>
         <w:tblLayout w:type="autofit"/>
         <w:tblBorders>
           <w:top w:val="single" w:sz="10" w:color="4F6272"/>
@@ -10858,7 +10853,6 @@
         <w:tblW w:type="pct" w:w="5000"/>
         <w:jc w:val="center"/>
         <w:tblLook w:firstRow="1" w:lastRow="0" w:firstColumn="0" w:lastColumn="0" w:noHBand="0" w:noVBand="0" w:val="0020"/>
-        <w:tblCaption w:val="Table 6. Predicting a group's atlas saving before building it, leave-one-content-class-out over eight classes spanning extreme image statistics (JPEG and WebP; 47 of 48 cells, one omitted for no overlapping quality range). Error is mean absolute error (percentage points) against the measured saving; rank is Spearman correlation with it. Six cheap source-image features do not beat a size-and-codec baseline, but a 10–20 tile probe encode predicts the saving to about two points and orders the classes far better."/>
         <w:tblLayout w:type="autofit"/>
         <w:tblBorders>
           <w:top w:val="single" w:sz="10" w:color="4F6272"/>
@@ -12091,7 +12085,6 @@
         <w:tblW w:type="pct" w:w="5000"/>
         <w:jc w:val="center"/>
         <w:tblLook w:firstRow="1" w:lastRow="0" w:firstColumn="0" w:lastColumn="0" w:noHBand="0" w:noVBand="0" w:val="0020"/>
-        <w:tblCaption w:val="Table 7. Out-of-sample evaluation of the construction heuristic on five independent corpora that played no role in its calibration (Noto emoji, OpenMoji, country flags, Flickr photos, Robohash avatars; 100 tiles each). An offline oracle enumerates every candidate configuration (individual, grid atlas, strip atlas, byte-bundle across the admissible codecs) at matched quality and reports the byte-optimal one; regret is a policy's bytes over the oracle's. The last three columns are simple fixed-layout rules a developer might hardcode, each still allowed the best admissible codec (individual files cost the same bytes as a byte-bundle). The calibrated heuristic matches the oracle on all five corpora; every fixed rule is beaten on at least one, because the winning layout is content-dependent. Smaller regret is better."/>
         <w:tblLayout w:type="autofit"/>
         <w:tblBorders>
           <w:top w:val="single" w:sz="10" w:color="4F6272"/>
@@ -15691,7 +15684,6 @@
         <w:tblW w:type="pct" w:w="5000"/>
         <w:jc w:val="center"/>
         <w:tblLook w:firstRow="1" w:lastRow="0" w:firstColumn="0" w:lastColumn="0" w:noHBand="0" w:noVBand="0" w:val="0020"/>
-        <w:tblCaption w:val="Table 8. Median time to all 500 tiles visible (ms) per serving condition, protocol, and network profile (n = 11 cold browser loads per cell; 12 run in randomized order, first dropped; WebP payloads). The atl-x column gives the single-atlas speedup over individual files with a 95% bootstrap confidence interval; bun-x is the byte-bundle speedup. Per-cell quartiles are in the released data."/>
         <w:tblLayout w:type="autofit"/>
         <w:tblBorders>
           <w:top w:val="single" w:sz="10" w:color="4F6272"/>
@@ -23333,7 +23325,6 @@
         <w:tblW w:type="pct" w:w="5000"/>
         <w:jc w:val="center"/>
         <w:tblLook w:firstRow="1" w:lastRow="0" w:firstColumn="0" w:lastColumn="0" w:noHBand="0" w:noVBand="0" w:val="0020"/>
-        <w:tblCaption w:val="Table 9. Measured browser cost of rendering N 96px photographic tiles three ways, in one Chromium instance with no network shaping: time to all tiles visible (ms) and renderer process-tree memory over a blank-page baseline (MB, capturing the decoded-image cache that JavaScript heap APIs miss). The pixel atlas is fastest to full visibility at every N (one decode paints all tiles) and uses the least memory (one decoded surface rather than N); the byte-bundle must fetch its whole object before the first tile and retains N blob-backed decodes, so it costs the most memory. This refines the analytical width×height×4 bound: for typical thumbnail collections the atlas is memory-favorable, and the decoded-memory caution applies to very large atlases, not to bundling per se."/>
         <w:tblLayout w:type="autofit"/>
         <w:tblBorders>
           <w:top w:val="single" w:sz="10" w:color="4F6272"/>
@@ -24834,7 +24825,6 @@
         <w:tblW w:type="pct" w:w="5000"/>
         <w:jc w:val="center"/>
         <w:tblLook w:firstRow="1" w:lastRow="0" w:firstColumn="0" w:lastColumn="0" w:noHBand="0" w:noVBand="0" w:val="0020"/>
-        <w:tblCaption w:val="Table 10. Display mechanisms for a bundled tile and how they differ in production. All four paint after a single atlas or bundle fetch; they diverge on image semantics, accessibility, loading control, and support. Pick the byte layout with the Section 6.2 selector and the mechanism here."/>
         <w:tblLayout w:type="autofit"/>
         <w:tblBorders>
           <w:top w:val="single" w:sz="10" w:color="4F6272"/>

</xml_diff>